<commit_message>
Export the submission PDF from the build script
The PDF was being produced by a separate manual LibreOffice invocation, which
meant it could silently fall out of step with the .docx after any edit to the
member list or section letter. It is now part of the build: one command produces
both, so they cannot diverge.

Falls back with a clear message if LibreOffice is absent rather than failing the
build, since the .docx is the primary artifact.

Verified the conversion preserves what matters: the university logo on the front
page, both figures and all six tables in the paper, the KPA form's merged P1 cell
spanning K3 to K8, and the untouched rubric. Fourteen pages.
</commit_message>
<xml_diff>
--- a/nothing/CSC471_Final_Assignment_SUBMISSION.docx
+++ b/nothing/CSC471_Final_Assignment_SUBMISSION.docx
@@ -11498,7 +11498,7 @@
 <file path=word/numbering.xml><?xml version="1.0" encoding="utf-8"?>
 <w:numbering xmlns:mc="http://schemas.openxmlformats.org/markup-compatibility/2006" xmlns:o="urn:schemas-microsoft-com:office:office" xmlns:r="http://schemas.openxmlformats.org/officeDocument/2006/relationships" xmlns:m="http://schemas.openxmlformats.org/officeDocument/2006/math" xmlns:v="urn:schemas-microsoft-com:vml" xmlns:wp="http://schemas.openxmlformats.org/drawingml/2006/wordprocessingDrawing" xmlns:w10="urn:schemas-microsoft-com:office:word" xmlns:w="http://schemas.openxmlformats.org/wordprocessingml/2006/main" xmlns:wne="http://schemas.microsoft.com/office/word/2006/wordml" xmlns:sl="http://schemas.openxmlformats.org/schemaLibrary/2006/main" xmlns:a="http://schemas.openxmlformats.org/drawingml/2006/main" xmlns:pic="http://schemas.openxmlformats.org/drawingml/2006/picture" xmlns:c="http://schemas.openxmlformats.org/drawingml/2006/chart" xmlns:lc="http://schemas.openxmlformats.org/drawingml/2006/lockedCanvas" xmlns:dgm="http://schemas.openxmlformats.org/drawingml/2006/diagram" xmlns:wps="http://schemas.microsoft.com/office/word/2010/wordprocessingShape" xmlns:wpg="http://schemas.microsoft.com/office/word/2010/wordprocessingGroup" xmlns:w14="http://schemas.microsoft.com/office/word/2010/wordml" xmlns:w15="http://schemas.microsoft.com/office/word/2012/wordml" xmlns:w16="http://schemas.microsoft.com/office/word/2018/wordml" xmlns:w16cex="http://schemas.microsoft.com/office/word/2018/wordml/cex" xmlns:w16cid="http://schemas.microsoft.com/office/word/2016/wordml/cid" xmlns="http://schemas.microsoft.com/office/tasks/2019/documenttasks" xmlns:cr="http://schemas.microsoft.com/office/comments/2020/reactions">
   <w:abstractNum w:abstractNumId="0">
-    <w:nsid w:val="0576BC7A"/>
+    <w:nsid w:val="02585CA8"/>
     <w:multiLevelType w:val="hybridMultilevel"/>
     <w:tmpl w:val="DDC68C58"/>
     <w:lvl w:ilvl="0" w:tplc="04090001">
@@ -11611,7 +11611,7 @@
     </w:lvl>
   </w:abstractNum>
   <w:abstractNum w:abstractNumId="1">
-    <w:nsid w:val="037635F8"/>
+    <w:nsid w:val="0446E4A3"/>
     <w:multiLevelType w:val="multilevel"/>
     <w:tmpl w:val="D62E5C12"/>
     <w:lvl w:ilvl="0">

</xml_diff>